<commit_message>
fix: align courseware with active course code
</commit_message>
<xml_diff>
--- a/courseware/LG-Master Mobile Photography.docx
+++ b/courseware/LG-Master Mobile Photography.docx
@@ -123,7 +123,7 @@
           <w:color w:val="111827"/>
           <w:sz w:val="24"/>
         </w:rPr>
-        <w:t>TGS Ref No: TGS-2022015227</w:t>
+        <w:t>TGS Ref No: TGS-2026064718</w:t>
       </w:r>
     </w:p>
     <w:p>
@@ -2356,7 +2356,7 @@
                 <w:rFonts w:ascii="Arial" w:hAnsi="Arial"/>
                 <w:sz w:val="18"/>
               </w:rPr>
-              <w:t>TGS-2022015227</w:t>
+              <w:t>TGS-2026064718</w:t>
             </w:r>
           </w:p>
         </w:tc>

</xml_diff>